<commit_message>
updating contributors and ToS regarding publications
</commit_message>
<xml_diff>
--- a/Data/Methods/Contributors_Methods_Data_website.docx
+++ b/Data/Methods/Contributors_Methods_Data_website.docx
@@ -201,6 +201,33 @@
           <w14:ligatures w14:val="none"/>
         </w:rPr>
         <w:t xml:space="preserve"> and partners across the University of Oxford and Northeastern University; please contact dav.ebengo@umie-inrb.org or pierre.akilimali@insp.cd for further information.</w:t>
+      </w:r>
+      <w:r>
+        <w:rPr>
+          <w:rFonts w:ascii="Times New Roman" w:eastAsia="Times New Roman" w:hAnsi="Times New Roman" w:cs="Times New Roman"/>
+          <w:color w:val="000000"/>
+          <w:kern w:val="0"/>
+          <w14:ligatures w14:val="none"/>
+        </w:rPr>
+        <w:t xml:space="preserve"> </w:t>
+      </w:r>
+      <w:r>
+        <w:rPr>
+          <w:rFonts w:ascii="Times New Roman" w:eastAsia="Times New Roman" w:hAnsi="Times New Roman" w:cs="Times New Roman"/>
+          <w:color w:val="000000"/>
+          <w:kern w:val="0"/>
+          <w14:ligatures w14:val="none"/>
+        </w:rPr>
+        <w:t>Please note that the epidemiological data presented here is based on work in progress and should be considered preliminary. Our analyses are ongoing, and a publication communicating our findings is in preparation. Contextual data are publicly accessible; please refer to the original license when re-using these data. If you intend to use the epidemiological data prior to our publication, or have other enquiries, please contact</w:t>
+      </w:r>
+      <w:r>
+        <w:rPr>
+          <w:rFonts w:ascii="Times New Roman" w:eastAsia="Times New Roman" w:hAnsi="Times New Roman" w:cs="Times New Roman"/>
+          <w:color w:val="000000"/>
+          <w:kern w:val="0"/>
+          <w14:ligatures w14:val="none"/>
+        </w:rPr>
+        <w:t xml:space="preserve"> one of the individuals referenced above. </w:t>
       </w:r>
     </w:p>
     <w:p>
@@ -901,7 +928,17 @@
           <w:kern w:val="0"/>
           <w14:ligatures w14:val="none"/>
         </w:rPr>
-        <w:t xml:space="preserve"> is treated as its own well-mixed sub-population with a fixed total population </w:t>
+        <w:t xml:space="preserve"> is treated as its own well-mixed sub-population with a fixed total </w:t>
+      </w:r>
+      <w:r>
+        <w:rPr>
+          <w:rFonts w:ascii="Times New Roman" w:eastAsia="Times New Roman" w:hAnsi="Times New Roman" w:cs="Times New Roman"/>
+          <w:color w:val="000000"/>
+          <w:kern w:val="0"/>
+          <w14:ligatures w14:val="none"/>
+        </w:rPr>
+        <w:lastRenderedPageBreak/>
+        <w:t xml:space="preserve">population </w:t>
       </w:r>
       <w:proofErr w:type="spellStart"/>
       <w:r>
@@ -1120,7 +1157,6 @@
           <w:kern w:val="0"/>
           <w14:ligatures w14:val="none"/>
         </w:rPr>
-        <w:lastRenderedPageBreak/>
         <w:t>    </w:t>
       </w:r>
       <w:r>
@@ -2427,7 +2463,17 @@
           <w:kern w:val="0"/>
           <w14:ligatures w14:val="none"/>
         </w:rPr>
-        <w:t>. Each combination is run 1,000 times via stochastic simulation. Scoring is log-RMSE between the observed and reporting-rate-scaled simulated case counts. We pool across initial conditions and parameters using Approximate Bayesian Computation to identify an overall most-favored scenario and calculate credible intervals.</w:t>
+        <w:t xml:space="preserve">. Each combination is run 1,000 times via stochastic simulation. Scoring is log-RMSE between the observed and reporting-rate-scaled simulated case counts. We pool across </w:t>
+      </w:r>
+      <w:r>
+        <w:rPr>
+          <w:rFonts w:ascii="Times New Roman" w:eastAsia="Times New Roman" w:hAnsi="Times New Roman" w:cs="Times New Roman"/>
+          <w:color w:val="000000"/>
+          <w:kern w:val="0"/>
+          <w14:ligatures w14:val="none"/>
+        </w:rPr>
+        <w:lastRenderedPageBreak/>
+        <w:t>initial conditions and parameters using Approximate Bayesian Computation to identify an overall most-favored scenario and calculate credible intervals.</w:t>
       </w:r>
     </w:p>
     <w:sectPr>

</xml_diff>

<commit_message>
Update contributors, data and methods
- Update contributors, data and methods
- Fix broken sitrep links and add a fallback
</commit_message>
<xml_diff>
--- a/Data/Methods/Contributors_Methods_Data_website.docx
+++ b/Data/Methods/Contributors_Methods_Data_website.docx
@@ -205,20 +205,25 @@
     </w:p>
     <w:p>
       <w:pPr>
-        <w:pStyle w:val="Heading2"/>
-        <w:rPr>
-          <w:rFonts w:eastAsia="Times New Roman"/>
-        </w:rPr>
-      </w:pPr>
-      <w:r>
-        <w:rPr>
-          <w:rFonts w:eastAsia="Times New Roman"/>
-        </w:rPr>
-        <w:t>Data</w:t>
+        <w:pStyle w:val="Heading3"/>
+        <w:rPr>
+          <w:rFonts w:ascii="Times New Roman" w:eastAsia="Times New Roman" w:hAnsi="Times New Roman" w:cs="Times New Roman"/>
+          <w:color w:val="000000"/>
+          <w:kern w:val="0"/>
+          <w14:ligatures w14:val="none"/>
+        </w:rPr>
+      </w:pPr>
+      <w:r>
+        <w:t>Collaborating institutions and agencies</w:t>
       </w:r>
     </w:p>
     <w:p>
       <w:pPr>
+        <w:pStyle w:val="ListParagraph"/>
+        <w:numPr>
+          <w:ilvl w:val="0"/>
+          <w:numId w:val="1"/>
+        </w:numPr>
         <w:spacing w:after="200" w:line="240" w:lineRule="auto"/>
         <w:rPr>
           <w:rFonts w:ascii="Times New Roman" w:eastAsia="Times New Roman" w:hAnsi="Times New Roman" w:cs="Times New Roman"/>
@@ -227,80 +232,339 @@
           <w14:ligatures w14:val="none"/>
         </w:rPr>
       </w:pPr>
-      <w:r>
-        <w:rPr>
-          <w:rFonts w:ascii="Times New Roman" w:eastAsia="Times New Roman" w:hAnsi="Times New Roman" w:cs="Times New Roman"/>
-          <w:color w:val="000000"/>
-          <w:kern w:val="0"/>
-          <w14:ligatures w14:val="none"/>
-        </w:rPr>
-        <w:t xml:space="preserve">The dashboard was built </w:t>
-      </w:r>
-      <w:r>
-        <w:rPr>
-          <w:rFonts w:ascii="Times New Roman" w:eastAsia="Times New Roman" w:hAnsi="Times New Roman" w:cs="Times New Roman"/>
-          <w:color w:val="000000"/>
-          <w:kern w:val="0"/>
-          <w14:ligatures w14:val="none"/>
-        </w:rPr>
-        <w:t xml:space="preserve">predominantly </w:t>
-      </w:r>
-      <w:r>
-        <w:rPr>
-          <w:rFonts w:ascii="Times New Roman" w:eastAsia="Times New Roman" w:hAnsi="Times New Roman" w:cs="Times New Roman"/>
-          <w:color w:val="000000"/>
-          <w:kern w:val="0"/>
-          <w14:ligatures w14:val="none"/>
-        </w:rPr>
-        <w:t>using open-access, publicly available data</w:t>
-      </w:r>
-      <w:r>
-        <w:rPr>
-          <w:rFonts w:ascii="Times New Roman" w:eastAsia="Times New Roman" w:hAnsi="Times New Roman" w:cs="Times New Roman"/>
-          <w:color w:val="000000"/>
-          <w:kern w:val="0"/>
-          <w14:ligatures w14:val="none"/>
-        </w:rPr>
-        <w:t xml:space="preserve">, and some private </w:t>
-      </w:r>
-      <w:proofErr w:type="spellStart"/>
-      <w:r>
-        <w:rPr>
-          <w:rFonts w:ascii="Times New Roman" w:eastAsia="Times New Roman" w:hAnsi="Times New Roman" w:cs="Times New Roman"/>
-          <w:color w:val="000000"/>
-          <w:kern w:val="0"/>
-          <w14:ligatures w14:val="none"/>
-        </w:rPr>
-        <w:t>linelist</w:t>
-      </w:r>
-      <w:proofErr w:type="spellEnd"/>
-      <w:r>
-        <w:rPr>
-          <w:rFonts w:ascii="Times New Roman" w:eastAsia="Times New Roman" w:hAnsi="Times New Roman" w:cs="Times New Roman"/>
-          <w:color w:val="000000"/>
-          <w:kern w:val="0"/>
-          <w14:ligatures w14:val="none"/>
-        </w:rPr>
-        <w:t xml:space="preserve"> data hosted by the INRB.</w:t>
+      <w:proofErr w:type="spellStart"/>
+      <w:r>
+        <w:rPr>
+          <w:rFonts w:ascii="Aptos" w:hAnsi="Aptos"/>
+          <w:color w:val="212121"/>
+        </w:rPr>
+        <w:t>Institut</w:t>
+      </w:r>
+      <w:proofErr w:type="spellEnd"/>
+      <w:r>
+        <w:rPr>
+          <w:rFonts w:ascii="Aptos" w:hAnsi="Aptos"/>
+          <w:color w:val="212121"/>
+        </w:rPr>
+        <w:t xml:space="preserve"> National de Santé </w:t>
+      </w:r>
+      <w:proofErr w:type="spellStart"/>
+      <w:r>
+        <w:rPr>
+          <w:rFonts w:ascii="Aptos" w:hAnsi="Aptos"/>
+          <w:color w:val="212121"/>
+        </w:rPr>
+        <w:t>Publique</w:t>
+      </w:r>
+      <w:proofErr w:type="spellEnd"/>
+      <w:r>
+        <w:rPr>
+          <w:rFonts w:ascii="Aptos" w:hAnsi="Aptos"/>
+          <w:color w:val="212121"/>
+        </w:rPr>
+        <w:t xml:space="preserve"> (INSP)</w:t>
       </w:r>
     </w:p>
     <w:p>
       <w:pPr>
-        <w:pStyle w:val="Heading3"/>
-        <w:rPr>
-          <w:rFonts w:eastAsia="Times New Roman"/>
-        </w:rPr>
-      </w:pPr>
-      <w:r>
-        <w:rPr>
-          <w:rFonts w:eastAsia="Times New Roman"/>
-        </w:rPr>
-        <w:t>Data sources</w:t>
+        <w:pStyle w:val="ListParagraph"/>
+        <w:numPr>
+          <w:ilvl w:val="0"/>
+          <w:numId w:val="1"/>
+        </w:numPr>
+        <w:spacing w:after="200" w:line="240" w:lineRule="auto"/>
+        <w:rPr>
+          <w:rFonts w:ascii="Times New Roman" w:eastAsia="Times New Roman" w:hAnsi="Times New Roman" w:cs="Times New Roman"/>
+          <w:color w:val="000000"/>
+          <w:kern w:val="0"/>
+          <w14:ligatures w14:val="none"/>
+        </w:rPr>
+      </w:pPr>
+      <w:r>
+        <w:rPr>
+          <w:rFonts w:ascii="Aptos" w:hAnsi="Aptos"/>
+          <w:color w:val="212121"/>
+        </w:rPr>
+        <w:t>National Institute of Biomedical Research (INRB)</w:t>
       </w:r>
     </w:p>
     <w:p>
       <w:pPr>
+        <w:pStyle w:val="ListParagraph"/>
+        <w:numPr>
+          <w:ilvl w:val="0"/>
+          <w:numId w:val="1"/>
+        </w:numPr>
         <w:spacing w:after="200" w:line="240" w:lineRule="auto"/>
+        <w:rPr>
+          <w:rFonts w:ascii="Times New Roman" w:eastAsia="Times New Roman" w:hAnsi="Times New Roman" w:cs="Times New Roman"/>
+          <w:color w:val="000000"/>
+          <w:kern w:val="0"/>
+          <w14:ligatures w14:val="none"/>
+        </w:rPr>
+      </w:pPr>
+      <w:r>
+        <w:rPr>
+          <w:rFonts w:ascii="Aptos" w:hAnsi="Aptos"/>
+          <w:color w:val="212121"/>
+        </w:rPr>
+        <w:t xml:space="preserve">Africa </w:t>
+      </w:r>
+      <w:proofErr w:type="spellStart"/>
+      <w:r>
+        <w:rPr>
+          <w:rFonts w:ascii="Aptos" w:hAnsi="Aptos"/>
+          <w:color w:val="212121"/>
+        </w:rPr>
+        <w:t>Centres</w:t>
+      </w:r>
+      <w:proofErr w:type="spellEnd"/>
+      <w:r>
+        <w:rPr>
+          <w:rFonts w:ascii="Aptos" w:hAnsi="Aptos"/>
+          <w:color w:val="212121"/>
+        </w:rPr>
+        <w:t xml:space="preserve"> for Disease Control and Prevention, Addis Ababa, Ethiopia</w:t>
+      </w:r>
+    </w:p>
+    <w:p>
+      <w:pPr>
+        <w:pStyle w:val="ListParagraph"/>
+        <w:numPr>
+          <w:ilvl w:val="0"/>
+          <w:numId w:val="1"/>
+        </w:numPr>
+        <w:spacing w:after="200" w:line="240" w:lineRule="auto"/>
+        <w:rPr>
+          <w:rFonts w:ascii="Times New Roman" w:eastAsia="Times New Roman" w:hAnsi="Times New Roman" w:cs="Times New Roman"/>
+          <w:color w:val="000000"/>
+          <w:kern w:val="0"/>
+          <w14:ligatures w14:val="none"/>
+        </w:rPr>
+      </w:pPr>
+      <w:r>
+        <w:rPr>
+          <w:rFonts w:ascii="Aptos" w:hAnsi="Aptos"/>
+          <w:color w:val="212121"/>
+        </w:rPr>
+        <w:t>World Health Organization, Geneva, Switzerland</w:t>
+      </w:r>
+    </w:p>
+    <w:p>
+      <w:pPr>
+        <w:pStyle w:val="ListParagraph"/>
+        <w:numPr>
+          <w:ilvl w:val="0"/>
+          <w:numId w:val="1"/>
+        </w:numPr>
+        <w:spacing w:after="200" w:line="240" w:lineRule="auto"/>
+        <w:rPr>
+          <w:rFonts w:ascii="Times New Roman" w:eastAsia="Times New Roman" w:hAnsi="Times New Roman" w:cs="Times New Roman"/>
+          <w:color w:val="000000"/>
+          <w:kern w:val="0"/>
+          <w14:ligatures w14:val="none"/>
+        </w:rPr>
+      </w:pPr>
+      <w:r>
+        <w:rPr>
+          <w:rFonts w:ascii="Aptos" w:hAnsi="Aptos"/>
+          <w:color w:val="212121"/>
+        </w:rPr>
+        <w:t>World Health Organization Country Office, Kinshasa, Democratic Republic of the Congo</w:t>
+      </w:r>
+    </w:p>
+    <w:p>
+      <w:pPr>
+        <w:pStyle w:val="ListParagraph"/>
+        <w:numPr>
+          <w:ilvl w:val="0"/>
+          <w:numId w:val="1"/>
+        </w:numPr>
+        <w:spacing w:after="200" w:line="240" w:lineRule="auto"/>
+        <w:rPr>
+          <w:rFonts w:ascii="Times New Roman" w:eastAsia="Times New Roman" w:hAnsi="Times New Roman" w:cs="Times New Roman"/>
+          <w:color w:val="000000"/>
+          <w:kern w:val="0"/>
+          <w14:ligatures w14:val="none"/>
+        </w:rPr>
+      </w:pPr>
+      <w:r>
+        <w:rPr>
+          <w:rFonts w:ascii="Aptos" w:hAnsi="Aptos"/>
+          <w:color w:val="212121"/>
+        </w:rPr>
+        <w:t>Northeastern University, United States</w:t>
+      </w:r>
+    </w:p>
+    <w:p>
+      <w:pPr>
+        <w:pStyle w:val="ListParagraph"/>
+        <w:numPr>
+          <w:ilvl w:val="0"/>
+          <w:numId w:val="1"/>
+        </w:numPr>
+        <w:spacing w:after="200" w:line="240" w:lineRule="auto"/>
+        <w:rPr>
+          <w:rFonts w:ascii="Times New Roman" w:eastAsia="Times New Roman" w:hAnsi="Times New Roman" w:cs="Times New Roman"/>
+          <w:color w:val="000000"/>
+          <w:kern w:val="0"/>
+          <w14:ligatures w14:val="none"/>
+        </w:rPr>
+      </w:pPr>
+      <w:r>
+        <w:rPr>
+          <w:rFonts w:ascii="Aptos" w:hAnsi="Aptos"/>
+          <w:color w:val="212121"/>
+        </w:rPr>
+        <w:t>University of Oxford, United Kingdom</w:t>
+      </w:r>
+    </w:p>
+    <w:p>
+      <w:pPr>
+        <w:pStyle w:val="Heading3"/>
+        <w:rPr>
+          <w:rFonts w:eastAsia="Times New Roman"/>
+        </w:rPr>
+      </w:pPr>
+      <w:r>
+        <w:rPr>
+          <w:rFonts w:eastAsia="Times New Roman"/>
+        </w:rPr>
+        <w:t>Statement on continuing work and analysis before publication</w:t>
+      </w:r>
+    </w:p>
+    <w:p>
+      <w:pPr>
+        <w:spacing w:after="200" w:line="240" w:lineRule="auto"/>
+        <w:rPr>
+          <w:rFonts w:ascii="Times New Roman" w:eastAsia="Times New Roman" w:hAnsi="Times New Roman" w:cs="Times New Roman"/>
+          <w:color w:val="000000"/>
+          <w:kern w:val="0"/>
+          <w14:ligatures w14:val="none"/>
+        </w:rPr>
+      </w:pPr>
+      <w:r>
+        <w:rPr>
+          <w:rFonts w:ascii="Aptos" w:hAnsi="Aptos"/>
+          <w:color w:val="212121"/>
+        </w:rPr>
+        <w:t>Please note that the epidemiological data presented here is based on work in progress and should be considered preliminary. Our analyses are ongoing, and a publication communicating our findings is in preparation. Contextual data are publicly accessible; please refer to the original license when re-using these data. If you intend to use the epidemiological data prior to our publication, please contact Prof. Placide Mbala-</w:t>
+      </w:r>
+      <w:proofErr w:type="spellStart"/>
+      <w:r>
+        <w:rPr>
+          <w:rFonts w:ascii="Aptos" w:hAnsi="Aptos"/>
+          <w:color w:val="212121"/>
+        </w:rPr>
+        <w:t>Kingebeni</w:t>
+      </w:r>
+      <w:proofErr w:type="spellEnd"/>
+      <w:r>
+        <w:rPr>
+          <w:rFonts w:ascii="Aptos" w:hAnsi="Aptos"/>
+          <w:color w:val="212121"/>
+        </w:rPr>
+        <w:t xml:space="preserve"> (INRB, DRC), Prof. Dav Ebengo (INRB, DRC), and Pierre Akilimali (INSP).</w:t>
+      </w:r>
+    </w:p>
+    <w:p>
+      <w:pPr>
+        <w:pStyle w:val="Heading2"/>
+        <w:rPr>
+          <w:rFonts w:eastAsia="Times New Roman"/>
+        </w:rPr>
+      </w:pPr>
+      <w:r>
+        <w:rPr>
+          <w:rFonts w:eastAsia="Times New Roman"/>
+        </w:rPr>
+        <w:t>Data</w:t>
+      </w:r>
+    </w:p>
+    <w:p>
+      <w:pPr>
+        <w:spacing w:after="200" w:line="240" w:lineRule="auto"/>
+        <w:rPr>
+          <w:rFonts w:ascii="Times New Roman" w:eastAsia="Times New Roman" w:hAnsi="Times New Roman" w:cs="Times New Roman"/>
+          <w:color w:val="000000"/>
+          <w:kern w:val="0"/>
+          <w14:ligatures w14:val="none"/>
+        </w:rPr>
+      </w:pPr>
+      <w:r>
+        <w:rPr>
+          <w:rFonts w:ascii="Times New Roman" w:eastAsia="Times New Roman" w:hAnsi="Times New Roman" w:cs="Times New Roman"/>
+          <w:color w:val="000000"/>
+          <w:kern w:val="0"/>
+          <w14:ligatures w14:val="none"/>
+        </w:rPr>
+        <w:t xml:space="preserve">The dashboard was built </w:t>
+      </w:r>
+      <w:r>
+        <w:rPr>
+          <w:rFonts w:ascii="Times New Roman" w:eastAsia="Times New Roman" w:hAnsi="Times New Roman" w:cs="Times New Roman"/>
+          <w:color w:val="000000"/>
+          <w:kern w:val="0"/>
+          <w14:ligatures w14:val="none"/>
+        </w:rPr>
+        <w:t xml:space="preserve">predominantly </w:t>
+      </w:r>
+      <w:r>
+        <w:rPr>
+          <w:rFonts w:ascii="Times New Roman" w:eastAsia="Times New Roman" w:hAnsi="Times New Roman" w:cs="Times New Roman"/>
+          <w:color w:val="000000"/>
+          <w:kern w:val="0"/>
+          <w14:ligatures w14:val="none"/>
+        </w:rPr>
+        <w:t>using open-access, publicly available data</w:t>
+      </w:r>
+      <w:r>
+        <w:rPr>
+          <w:rFonts w:ascii="Times New Roman" w:eastAsia="Times New Roman" w:hAnsi="Times New Roman" w:cs="Times New Roman"/>
+          <w:color w:val="000000"/>
+          <w:kern w:val="0"/>
+          <w14:ligatures w14:val="none"/>
+        </w:rPr>
+        <w:t xml:space="preserve">, and some private </w:t>
+      </w:r>
+      <w:proofErr w:type="spellStart"/>
+      <w:r>
+        <w:rPr>
+          <w:rFonts w:ascii="Times New Roman" w:eastAsia="Times New Roman" w:hAnsi="Times New Roman" w:cs="Times New Roman"/>
+          <w:color w:val="000000"/>
+          <w:kern w:val="0"/>
+          <w14:ligatures w14:val="none"/>
+        </w:rPr>
+        <w:t>linelist</w:t>
+      </w:r>
+      <w:proofErr w:type="spellEnd"/>
+      <w:r>
+        <w:rPr>
+          <w:rFonts w:ascii="Times New Roman" w:eastAsia="Times New Roman" w:hAnsi="Times New Roman" w:cs="Times New Roman"/>
+          <w:color w:val="000000"/>
+          <w:kern w:val="0"/>
+          <w14:ligatures w14:val="none"/>
+        </w:rPr>
+        <w:t xml:space="preserve"> data hosted by the INRB.</w:t>
+      </w:r>
+    </w:p>
+    <w:p>
+      <w:pPr>
+        <w:pStyle w:val="Heading3"/>
+        <w:rPr>
+          <w:rFonts w:eastAsia="Times New Roman"/>
+        </w:rPr>
+      </w:pPr>
+      <w:r>
+        <w:rPr>
+          <w:rFonts w:eastAsia="Times New Roman"/>
+        </w:rPr>
+        <w:t>Data sources</w:t>
+      </w:r>
+    </w:p>
+    <w:p>
+      <w:pPr>
+        <w:spacing w:after="200" w:line="240" w:lineRule="auto"/>
       </w:pPr>
       <w:r>
         <w:rPr>
@@ -317,7 +581,7 @@
         </w:rPr>
         <w:t xml:space="preserve"> </w:t>
       </w:r>
-      <w:hyperlink r:id="rId4" w:history="1">
+      <w:hyperlink r:id="rId5" w:history="1">
         <w:r>
           <w:rPr>
             <w:rStyle w:val="Hyperlink"/>
@@ -345,7 +609,7 @@
         </w:rPr>
         <w:t xml:space="preserve">Administrative boundaries are the DRC Ministry of Health zones de santé (519 zones) based on publicly available shape files from the </w:t>
       </w:r>
-      <w:hyperlink r:id="rId5" w:history="1">
+      <w:hyperlink r:id="rId6" w:history="1">
         <w:r>
           <w:rPr>
             <w:rStyle w:val="Hyperlink"/>
@@ -365,7 +629,7 @@
         </w:rPr>
         <w:t xml:space="preserve">, joined to a separate set of 300-dimensional </w:t>
       </w:r>
-      <w:hyperlink r:id="rId6" w:history="1">
+      <w:hyperlink r:id="rId7" w:history="1">
         <w:r>
           <w:rPr>
             <w:rStyle w:val="Hyperlink"/>
@@ -403,7 +667,7 @@
         </w:rPr>
         <w:t xml:space="preserve"> </w:t>
       </w:r>
-      <w:hyperlink r:id="rId7" w:history="1">
+      <w:hyperlink r:id="rId8" w:history="1">
         <w:proofErr w:type="spellStart"/>
         <w:r>
           <w:rPr>
@@ -472,7 +736,7 @@
         </w:rPr>
         <w:t xml:space="preserve"> populations are sums of the </w:t>
       </w:r>
-      <w:hyperlink r:id="rId8" w:history="1">
+      <w:hyperlink r:id="rId9" w:history="1">
         <w:r>
           <w:rPr>
             <w:rStyle w:val="Hyperlink"/>
@@ -564,9 +828,19 @@
           <w:kern w:val="0"/>
           <w14:ligatures w14:val="none"/>
         </w:rPr>
-        <w:t xml:space="preserve"> shapefile. Health-facility counts come from </w:t>
-      </w:r>
-      <w:hyperlink r:id="rId9" w:history="1">
+        <w:t xml:space="preserve"> shapefile. </w:t>
+      </w:r>
+      <w:r>
+        <w:rPr>
+          <w:rFonts w:ascii="Times New Roman" w:eastAsia="Times New Roman" w:hAnsi="Times New Roman" w:cs="Times New Roman"/>
+          <w:color w:val="000000"/>
+          <w:kern w:val="0"/>
+          <w14:ligatures w14:val="none"/>
+        </w:rPr>
+        <w:lastRenderedPageBreak/>
+        <w:t xml:space="preserve">Health-facility counts come from </w:t>
+      </w:r>
+      <w:hyperlink r:id="rId10" w:history="1">
         <w:r>
           <w:rPr>
             <w:rStyle w:val="Hyperlink"/>
@@ -622,7 +896,7 @@
         </w:rPr>
         <w:t xml:space="preserve"> pulled from </w:t>
       </w:r>
-      <w:hyperlink r:id="rId10" w:history="1">
+      <w:hyperlink r:id="rId11" w:history="1">
         <w:r>
           <w:rPr>
             <w:rStyle w:val="Hyperlink"/>
@@ -671,7 +945,7 @@
         </w:rPr>
         <w:t xml:space="preserve">Pairwise driving travel times are obtained from the public </w:t>
       </w:r>
-      <w:hyperlink r:id="rId11" w:history="1">
+      <w:hyperlink r:id="rId12" w:history="1">
         <w:r>
           <w:rPr>
             <w:rStyle w:val="Hyperlink"/>
@@ -718,7 +992,7 @@
         </w:rPr>
         <w:t xml:space="preserve">PCR testing capacity data was made available by </w:t>
       </w:r>
-      <w:hyperlink r:id="rId12" w:history="1">
+      <w:hyperlink r:id="rId13" w:history="1">
         <w:proofErr w:type="spellStart"/>
         <w:r>
           <w:rPr>
@@ -758,7 +1032,7 @@
         </w:rPr>
         <w:t xml:space="preserve">latest </w:t>
       </w:r>
-      <w:hyperlink r:id="rId13" w:history="1">
+      <w:hyperlink r:id="rId14" w:history="1">
         <w:r>
           <w:rPr>
             <w:rStyle w:val="Hyperlink"/>
@@ -1120,7 +1394,6 @@
           <w:kern w:val="0"/>
           <w14:ligatures w14:val="none"/>
         </w:rPr>
-        <w:lastRenderedPageBreak/>
         <w:t>    </w:t>
       </w:r>
       <w:r>
@@ -1899,6 +2172,7 @@
           <w:kern w:val="0"/>
           <w14:ligatures w14:val="none"/>
         </w:rPr>
+        <w:lastRenderedPageBreak/>
         <w:t>M_ij</w:t>
       </w:r>
       <w:proofErr w:type="spellEnd"/>
@@ -2438,6 +2712,127 @@
     </w:sectPr>
   </w:body>
 </w:document>
+</file>
+
+<file path=word/numbering.xml><?xml version="1.0" encoding="utf-8"?>
+<w:numbering xmlns:wpc="http://schemas.microsoft.com/office/word/2010/wordprocessingCanvas" xmlns:cx="http://schemas.microsoft.com/office/drawing/2014/chartex" xmlns:cx1="http://schemas.microsoft.com/office/drawing/2015/9/8/chartex" xmlns:cx2="http://schemas.microsoft.com/office/drawing/2015/10/21/chartex" xmlns:cx3="http://schemas.microsoft.com/office/drawing/2016/5/9/chartex" xmlns:cx4="http://schemas.microsoft.com/office/drawing/2016/5/10/chartex" xmlns:cx5="http://schemas.microsoft.com/office/drawing/2016/5/11/chartex" xmlns:cx6="http://schemas.microsoft.com/office/drawing/2016/5/12/chartex" xmlns:cx7="http://schemas.microsoft.com/office/drawing/2016/5/13/chartex" xmlns:cx8="http://schemas.microsoft.com/office/drawing/2016/5/14/chartex" xmlns:mc="http://schemas.openxmlformats.org/markup-compatibility/2006" xmlns:aink="http://schemas.microsoft.com/office/drawing/2016/ink" xmlns:am3d="http://schemas.microsoft.com/office/drawing/2017/model3d" xmlns:o="urn:schemas-microsoft-com:office:office" xmlns:oel="http://schemas.microsoft.com/office/2019/extlst" xmlns:r="http://schemas.openxmlformats.org/officeDocument/2006/relationships" xmlns:m="http://schemas.openxmlformats.org/officeDocument/2006/math" xmlns:v="urn:schemas-microsoft-com:vml" xmlns:wp14="http://schemas.microsoft.com/office/word/2010/wordprocessingDrawing" xmlns:wp="http://schemas.openxmlformats.org/drawingml/2006/wordprocessingDrawing" xmlns:w10="urn:schemas-microsoft-com:office:word" xmlns:w="http://schemas.openxmlformats.org/wordprocessingml/2006/main" xmlns:w14="http://schemas.microsoft.com/office/word/2010/wordml" xmlns:w15="http://schemas.microsoft.com/office/word/2012/wordml" xmlns:w16cex="http://schemas.microsoft.com/office/word/2018/wordml/cex" xmlns:w16cid="http://schemas.microsoft.com/office/word/2016/wordml/cid" xmlns:w16="http://schemas.microsoft.com/office/word/2018/wordml" xmlns:w16du="http://schemas.microsoft.com/office/word/2023/wordml/word16du" xmlns:w16sdtdh="http://schemas.microsoft.com/office/word/2020/wordml/sdtdatahash" xmlns:w16sdtfl="http://schemas.microsoft.com/office/word/2024/wordml/sdtformatlock" xmlns:w16se="http://schemas.microsoft.com/office/word/2015/wordml/symex" xmlns:wpg="http://schemas.microsoft.com/office/word/2010/wordprocessingGroup" xmlns:wpi="http://schemas.microsoft.com/office/word/2010/wordprocessingInk" xmlns:wne="http://schemas.microsoft.com/office/word/2006/wordml" xmlns:wps="http://schemas.microsoft.com/office/word/2010/wordprocessingShape" mc:Ignorable="w14 w15 w16se w16cid w16 w16cex w16sdtdh w16sdtfl w16du wp14">
+  <w:abstractNum w:abstractNumId="0" w15:restartNumberingAfterBreak="0">
+    <w:nsid w:val="6E271145"/>
+    <w:multiLevelType w:val="hybridMultilevel"/>
+    <w:tmpl w:val="8CF87C60"/>
+    <w:lvl w:ilvl="0" w:tplc="08090001">
+      <w:start w:val="1"/>
+      <w:numFmt w:val="bullet"/>
+      <w:lvlText w:val=""/>
+      <w:lvlJc w:val="left"/>
+      <w:pPr>
+        <w:ind w:left="720" w:hanging="360"/>
+      </w:pPr>
+      <w:rPr>
+        <w:rFonts w:ascii="Symbol" w:hAnsi="Symbol" w:hint="default"/>
+      </w:rPr>
+    </w:lvl>
+    <w:lvl w:ilvl="1" w:tplc="08090003" w:tentative="1">
+      <w:start w:val="1"/>
+      <w:numFmt w:val="bullet"/>
+      <w:lvlText w:val="o"/>
+      <w:lvlJc w:val="left"/>
+      <w:pPr>
+        <w:ind w:left="1440" w:hanging="360"/>
+      </w:pPr>
+      <w:rPr>
+        <w:rFonts w:ascii="Courier New" w:hAnsi="Courier New" w:cs="Courier New" w:hint="default"/>
+      </w:rPr>
+    </w:lvl>
+    <w:lvl w:ilvl="2" w:tplc="08090005" w:tentative="1">
+      <w:start w:val="1"/>
+      <w:numFmt w:val="bullet"/>
+      <w:lvlText w:val=""/>
+      <w:lvlJc w:val="left"/>
+      <w:pPr>
+        <w:ind w:left="2160" w:hanging="360"/>
+      </w:pPr>
+      <w:rPr>
+        <w:rFonts w:ascii="Wingdings" w:hAnsi="Wingdings" w:hint="default"/>
+      </w:rPr>
+    </w:lvl>
+    <w:lvl w:ilvl="3" w:tplc="08090001" w:tentative="1">
+      <w:start w:val="1"/>
+      <w:numFmt w:val="bullet"/>
+      <w:lvlText w:val=""/>
+      <w:lvlJc w:val="left"/>
+      <w:pPr>
+        <w:ind w:left="2880" w:hanging="360"/>
+      </w:pPr>
+      <w:rPr>
+        <w:rFonts w:ascii="Symbol" w:hAnsi="Symbol" w:hint="default"/>
+      </w:rPr>
+    </w:lvl>
+    <w:lvl w:ilvl="4" w:tplc="08090003" w:tentative="1">
+      <w:start w:val="1"/>
+      <w:numFmt w:val="bullet"/>
+      <w:lvlText w:val="o"/>
+      <w:lvlJc w:val="left"/>
+      <w:pPr>
+        <w:ind w:left="3600" w:hanging="360"/>
+      </w:pPr>
+      <w:rPr>
+        <w:rFonts w:ascii="Courier New" w:hAnsi="Courier New" w:cs="Courier New" w:hint="default"/>
+      </w:rPr>
+    </w:lvl>
+    <w:lvl w:ilvl="5" w:tplc="08090005" w:tentative="1">
+      <w:start w:val="1"/>
+      <w:numFmt w:val="bullet"/>
+      <w:lvlText w:val=""/>
+      <w:lvlJc w:val="left"/>
+      <w:pPr>
+        <w:ind w:left="4320" w:hanging="360"/>
+      </w:pPr>
+      <w:rPr>
+        <w:rFonts w:ascii="Wingdings" w:hAnsi="Wingdings" w:hint="default"/>
+      </w:rPr>
+    </w:lvl>
+    <w:lvl w:ilvl="6" w:tplc="08090001" w:tentative="1">
+      <w:start w:val="1"/>
+      <w:numFmt w:val="bullet"/>
+      <w:lvlText w:val=""/>
+      <w:lvlJc w:val="left"/>
+      <w:pPr>
+        <w:ind w:left="5040" w:hanging="360"/>
+      </w:pPr>
+      <w:rPr>
+        <w:rFonts w:ascii="Symbol" w:hAnsi="Symbol" w:hint="default"/>
+      </w:rPr>
+    </w:lvl>
+    <w:lvl w:ilvl="7" w:tplc="08090003" w:tentative="1">
+      <w:start w:val="1"/>
+      <w:numFmt w:val="bullet"/>
+      <w:lvlText w:val="o"/>
+      <w:lvlJc w:val="left"/>
+      <w:pPr>
+        <w:ind w:left="5760" w:hanging="360"/>
+      </w:pPr>
+      <w:rPr>
+        <w:rFonts w:ascii="Courier New" w:hAnsi="Courier New" w:cs="Courier New" w:hint="default"/>
+      </w:rPr>
+    </w:lvl>
+    <w:lvl w:ilvl="8" w:tplc="08090005" w:tentative="1">
+      <w:start w:val="1"/>
+      <w:numFmt w:val="bullet"/>
+      <w:lvlText w:val=""/>
+      <w:lvlJc w:val="left"/>
+      <w:pPr>
+        <w:ind w:left="6480" w:hanging="360"/>
+      </w:pPr>
+      <w:rPr>
+        <w:rFonts w:ascii="Wingdings" w:hAnsi="Wingdings" w:hint="default"/>
+      </w:rPr>
+    </w:lvl>
+  </w:abstractNum>
+  <w:num w:numId="1" w16cid:durableId="946693616">
+    <w:abstractNumId w:val="0"/>
+  </w:num>
+</w:numbering>
 </file>
 
 <file path=word/styles.xml><?xml version="1.0" encoding="utf-8"?>

</xml_diff>